<commit_message>
chore: initialize monorepo with workspaces and add shared package
</commit_message>
<xml_diff>
--- a/איפיונים ושונות/SederYom_FRD.docx
+++ b/איפיונים ושונות/SederYom_FRD.docx
@@ -48,7 +48,7 @@
         <w:spacing w:after="100"/>
       </w:pPr>
       <w:r>
-        <w:t xml:space="preserve">SederYom היא אפליקציית ווב רספונסיבית למנהל תכנון שבועי עם סנכרון Google Calendar, ארכיון אינסופי, ותראות דחיפה בקנה מידה גדול.</w:t>
+        <w:t xml:space="preserve">SederYom היא אפליקציית ווב רספונסיבית למנהל תכנון שבועי עם סנכרון Google Calendar, ארכיון אינסופי, ותראות דחיפה.</w:t>
       </w:r>
     </w:p>
     <w:p>
@@ -104,7 +104,7 @@
         <w:spacing w:after="300"/>
       </w:pPr>
       <w:r>
-        <w:t xml:space="preserve">✓ Push Notifications (Firebase + RabbitMQ queue)</w:t>
+        <w:t xml:space="preserve">✓ Push Notifications (Firebase Cloud Messaging)</w:t>
       </w:r>
     </w:p>
     <w:r>
@@ -204,7 +204,7 @@
         <w:spacing w:after="100"/>
       </w:pPr>
       <w:r>
-        <w:t xml:space="preserve">2FA Code: exactly 6 digits | Error (He): "קוד חייב להיות 6 ספרות" | Error (En): "Code must be 6 digits"</w:t>
+        <w:t xml:space="preserve">2FA Code: exactly 6 digits, maxlength="6" | Error (He): "קוד חייב להיות 6 ספרות" | Error (En): "Code must be 6 digits"</w:t>
       </w:r>
     </w:p>
     <w:p>
@@ -218,10 +218,26 @@
     </w:p>
     <w:p>
       <w:pPr>
-        <w:spacing w:after="30"/>
-      </w:pPr>
-      <w:r>
-        <w:t xml:space="preserve">Title: max 80 chars | Description: max 200 chars (2 lines + "Show More" if &gt; 80)</w:t>
+        <w:spacing w:after="20"/>
+      </w:pPr>
+      <w:r>
+        <w:t xml:space="preserve">Title: max 80 chars | maxlength + slice(0, 80)</w:t>
+      </w:r>
+    </w:p>
+    <w:p>
+      <w:pPr>
+        <w:spacing w:after="30"/>
+      </w:pPr>
+      <w:r>
+        <w:t xml:space="preserve">• Error (He): "כותרת נדרשת" | Error (En): "Title is required"</w:t>
+      </w:r>
+    </w:p>
+    <w:p>
+      <w:pPr>
+        <w:spacing w:after="30"/>
+      </w:pPr>
+      <w:r>
+        <w:t xml:space="preserve">Description: max 200 chars | maxlength + slice(0, 200) | UI: 2 lines + "Show More" if &gt; 80</w:t>
       </w:r>
     </w:p>
     <w:p>
@@ -229,7 +245,7 @@
         <w:spacing w:after="100"/>
       </w:pPr>
       <w:r>
-        <w:t xml:space="preserve">Note: max 500 chars (2 lines + "Show More" if &gt; 80)</w:t>
+        <w:t xml:space="preserve">Note: max 500 chars | maxlength + slice(0, 500) | UI: 2 lines + "Show More" if &gt; 80</w:t>
       </w:r>
     </w:p>
     <w:p>
@@ -243,10 +259,34 @@
     </w:p>
     <w:p>
       <w:pPr>
+        <w:spacing w:after="20"/>
+      </w:pPr>
+      <w:r>
+        <w:t xml:space="preserve">Start/End: HH:mm format | Validation: start &lt; end (if not all-day)</w:t>
+      </w:r>
+    </w:p>
+    <w:p>
+      <w:pPr>
+        <w:spacing w:after="20"/>
+      </w:pPr>
+      <w:r>
+        <w:t xml:space="preserve">• Error UI: RED field background</w:t>
+      </w:r>
+    </w:p>
+    <w:p>
+      <w:pPr>
+        <w:spacing w:after="20"/>
+      </w:pPr>
+      <w:r>
+        <w:t xml:space="preserve">• Error (He): "שעת סיום חייבת להיות אחרי שעת התחלה"</w:t>
+      </w:r>
+    </w:p>
+    <w:p>
+      <w:pPr>
         <w:spacing w:after="100"/>
       </w:pPr>
       <w:r>
-        <w:t xml:space="preserve">Start &lt; End validation | Error UI: RED field | Error (He): "שעת סיום חייבת להיות אחרי שעת התחלה"</w:t>
+        <w:t xml:space="preserve">• Error (En): "End time must be after start time"</w:t>
       </w:r>
     </w:p>
     <w:p>
@@ -260,10 +300,50 @@
     </w:p>
     <w:p>
       <w:pPr>
+        <w:spacing w:after="20"/>
+      </w:pPr>
+      <w:r>
+        <w:t xml:space="preserve">Max 5 files per event | Max 10 MB per file | Max 25 MB total</w:t>
+      </w:r>
+    </w:p>
+    <w:p>
+      <w:pPr>
+        <w:spacing w:after="20"/>
+      </w:pPr>
+      <w:r>
+        <w:t xml:space="preserve">Allowed: PNG, JPG, WebP, PDF, DOC/DOCX, XLS/XLSX, PPT/PPTX, CSV, TXT</w:t>
+      </w:r>
+    </w:p>
+    <w:p>
+      <w:pPr>
+        <w:spacing w:after="20"/>
+      </w:pPr>
+      <w:r>
+        <w:t xml:space="preserve">Duplicate prevention: same filename + size = rejected</w:t>
+      </w:r>
+    </w:p>
+    <w:p>
+      <w:pPr>
+        <w:spacing w:after="20"/>
+      </w:pPr>
+      <w:r>
+        <w:t xml:space="preserve">Errors (He/En): "גודל הקובץ חייב להיות פחות מ-10 MB" / "File size must be under 10 MB"</w:t>
+      </w:r>
+    </w:p>
+    <w:p>
+      <w:pPr>
+        <w:spacing w:after="20"/>
+      </w:pPr>
+      <w:r>
+        <w:t xml:space="preserve">"מקסימום 5 קבצים לאירוע" / "Maximum 5 files per event"</w:t>
+      </w:r>
+    </w:p>
+    <w:p>
+      <w:pPr>
         <w:spacing w:after="300"/>
       </w:pPr>
       <w:r>
-        <w:t xml:space="preserve">Max 5 files | Max 10 MB per file | Max 25 MB total | Formats: PNG, JPG, WebP, PDF, DOC/DOCX, XLS/XLSX, PPT/PPTX, CSV, TXT</w:t>
+        <w:t xml:space="preserve">"קובץ זה כבר קיים באירוע זה" / "This file already exists in this event"</w:t>
       </w:r>
     </w:p>
     <w:r>
@@ -325,7 +405,23 @@
         <w:spacing w:after="100" w:before="150"/>
       </w:pPr>
       <w:r>
-        <w:t xml:space="preserve">4.2 Frontend Caching</w:t>
+        <w:t xml:space="preserve">4.2 Frontend Caching (Supabase-Based)</w:t>
+      </w:r>
+    </w:p>
+    <w:p>
+      <w:pPr>
+        <w:spacing w:after="30"/>
+      </w:pPr>
+      <w:r>
+        <w:t xml:space="preserve">Strategy: Cache archived days in React state as they load</w:t>
+      </w:r>
+    </w:p>
+    <w:p>
+      <w:pPr>
+        <w:spacing w:after="30"/>
+      </w:pPr>
+      <w:r>
+        <w:t xml:space="preserve">Benefits: No refetch on scroll up/down, smooth UX</w:t>
       </w:r>
     </w:p>
     <w:p>
@@ -333,7 +429,7 @@
         <w:spacing w:after="100"/>
       </w:pPr>
       <w:r>
-        <w:t xml:space="preserve">React state caches loaded pages | No refetch on scroll | Filter cached results client-side</w:t>
+        <w:t xml:space="preserve">Search: Filter cached results client-side before querying backend</w:t>
       </w:r>
     </w:p>
     <w:p>
@@ -342,12 +438,12 @@
         <w:spacing w:after="100" w:before="150"/>
       </w:pPr>
       <w:r>
-        <w:t xml:space="preserve">4.3 Backend API &amp; Database</w:t>
-      </w:r>
-    </w:p>
-    <w:p>
-      <w:pPr>
-        <w:spacing w:after="20"/>
+        <w:t xml:space="preserve">4.3 Backend API</w:t>
+      </w:r>
+    </w:p>
+    <w:p>
+      <w:pPr>
+        <w:spacing w:after="30"/>
       </w:pPr>
       <w:r>
         <w:t xml:space="preserve">GET /archive?limit=50&amp;offset=0&amp;search=query</w:t>
@@ -355,10 +451,35 @@
     </w:p>
     <w:p>
       <w:pPr>
-        <w:spacing w:after="20"/>
-      </w:pPr>
-      <w:r>
-        <w:t xml:space="preserve">Index: CREATE INDEX ON archived_days(user_id DESC, yr DESC, mon DESC, day DESC)</w:t>
+        <w:spacing w:after="30"/>
+      </w:pPr>
+      <w:r>
+        <w:t xml:space="preserve">Response: { days: [ArchivedDay], total_count: number, has_more: bool }</w:t>
+      </w:r>
+    </w:p>
+    <w:p>
+      <w:pPr>
+        <w:spacing w:after="100"/>
+      </w:pPr>
+      <w:r>
+        <w:t xml:space="preserve">Database: SELECT with WHERE user_id AND optional search LIMIT 50 OFFSET N</w:t>
+      </w:r>
+    </w:p>
+    <w:p>
+      <w:pPr>
+        <w:pStyle w:val="Heading2"/>
+        <w:spacing w:after="100" w:before="150"/>
+      </w:pPr>
+      <w:r>
+        <w:t xml:space="preserve">4.4 Indexing &amp; Performance</w:t>
+      </w:r>
+    </w:p>
+    <w:p>
+      <w:pPr>
+        <w:spacing w:after="30"/>
+      </w:pPr>
+      <w:r>
+        <w:t xml:space="preserve">Database Index: CREATE INDEX ON archived_days(user_id DESC, yr DESC, mon DESC, day DESC)</w:t>
       </w:r>
     </w:p>
     <w:p>
@@ -366,7 +487,7 @@
         <w:spacing w:after="300"/>
       </w:pPr>
       <w:r>
-        <w:t xml:space="preserve">Query time: &lt; 50ms with indexing</w:t>
+        <w:t xml:space="preserve">Query Speed: &lt; 50ms with proper indexing</w:t>
       </w:r>
     </w:p>
     <w:r>
@@ -378,7 +499,63 @@
         <w:spacing w:after="150" w:before="200"/>
       </w:pPr>
       <w:r>
-        <w:t xml:space="preserve">5. Technology Stack (טכנולוגיה)</w:t>
+        <w:t xml:space="preserve">5. Technology Stack (סטאק טכנולוגיה)</w:t>
+      </w:r>
+    </w:p>
+    <w:p>
+      <w:pPr>
+        <w:spacing w:after="30"/>
+      </w:pPr>
+      <w:r>
+        <w:t xml:space="preserve">Frontend: React 19 (Vite, Tailwind, @dnd-kit, react-i18next)</w:t>
+      </w:r>
+    </w:p>
+    <w:p>
+      <w:pPr>
+        <w:spacing w:after="30"/>
+      </w:pPr>
+      <w:r>
+        <w:t xml:space="preserve">Backend: Node.js + Express</w:t>
+      </w:r>
+    </w:p>
+    <w:p>
+      <w:pPr>
+        <w:spacing w:after="30"/>
+      </w:pPr>
+      <w:r>
+        <w:t xml:space="preserve">Database: Supabase (PostgreSQL with RLS)</w:t>
+      </w:r>
+    </w:p>
+    <w:p>
+      <w:pPr>
+        <w:spacing w:after="30"/>
+      </w:pPr>
+      <w:r>
+        <w:t xml:space="preserve">Auth: Supabase Auth (2FA OTP)</w:t>
+      </w:r>
+    </w:p>
+    <w:p>
+      <w:pPr>
+        <w:spacing w:after="30"/>
+      </w:pPr>
+      <w:r>
+        <w:t xml:space="preserve">Notifications: Firebase Cloud Messaging</w:t>
+      </w:r>
+    </w:p>
+    <w:p>
+      <w:pPr>
+        <w:spacing w:after="30"/>
+      </w:pPr>
+      <w:r>
+        <w:t xml:space="preserve">Message Queue: RabbitMQ (notification worker)</w:t>
+      </w:r>
+    </w:p>
+    <w:p>
+      <w:pPr>
+        <w:spacing w:after="300"/>
+      </w:pPr>
+      <w:r>
+        <w:t xml:space="preserve">Validation: Zod (backend + frontend)</w:t>
       </w:r>
     </w:p>
     <w:p>
@@ -387,196 +564,39 @@
         <w:spacing w:after="100" w:before="150"/>
       </w:pPr>
       <w:r>
-        <w:t xml:space="preserve">5.1 Frontend</w:t>
-      </w:r>
-    </w:p>
-    <w:p>
-      <w:pPr>
-        <w:spacing w:after="30"/>
-      </w:pPr>
-      <w:r>
-        <w:t xml:space="preserve">React 18 + Vite + Tailwind CSS + @dnd-kit + react-i18next</w:t>
-      </w:r>
-    </w:p>
-    <w:p>
-      <w:pPr>
-        <w:spacing w:after="100"/>
-      </w:pPr>
-      <w:r>
-        <w:t xml:space="preserve">Deployment: Vercel</w:t>
-      </w:r>
-    </w:p>
-    <w:p>
-      <w:pPr>
-        <w:pStyle w:val="Heading2"/>
-        <w:spacing w:after="100" w:before="150"/>
-      </w:pPr>
-      <w:r>
-        <w:t xml:space="preserve">5.2 Backend</w:t>
-      </w:r>
-    </w:p>
-    <w:p>
-      <w:pPr>
-        <w:spacing w:after="30"/>
-      </w:pPr>
-      <w:r>
-        <w:t xml:space="preserve">Node.js + Express + Drizzle ORM</w:t>
-      </w:r>
-    </w:p>
-    <w:p>
-      <w:pPr>
-        <w:spacing w:after="30"/>
-      </w:pPr>
-      <w:r>
-        <w:t xml:space="preserve">Containerized: Docker</w:t>
-      </w:r>
-    </w:p>
-    <w:p>
-      <w:pPr>
-        <w:spacing w:after="100"/>
-      </w:pPr>
-      <w:r>
-        <w:t xml:space="preserve">Deployment: Render</w:t>
-      </w:r>
-    </w:p>
-    <w:p>
-      <w:pPr>
-        <w:pStyle w:val="Heading2"/>
-        <w:spacing w:after="100" w:before="150"/>
-      </w:pPr>
-      <w:r>
-        <w:t xml:space="preserve">5.3 Database</w:t>
-      </w:r>
-    </w:p>
-    <w:p>
-      <w:pPr>
-        <w:spacing w:after="100"/>
-      </w:pPr>
-      <w:r>
-        <w:t xml:space="preserve">Supabase (PostgreSQL with Row-Level Security)</w:t>
-      </w:r>
-    </w:p>
-    <w:p>
-      <w:pPr>
-        <w:pStyle w:val="Heading2"/>
-        <w:spacing w:after="100" w:before="150"/>
-      </w:pPr>
-      <w:r>
-        <w:t xml:space="preserve">5.4 Message Queue (Notification Optimization)</w:t>
-      </w:r>
-    </w:p>
-    <w:p>
-      <w:pPr>
-        <w:spacing w:after="30"/>
-      </w:pPr>
-      <w:r>
-        <w:t xml:space="preserve">RabbitMQ: async queue for push notifications at scale</w:t>
-      </w:r>
-    </w:p>
-    <w:p>
-      <w:pPr>
-        <w:spacing w:after="30"/>
-      </w:pPr>
-      <w:r>
-        <w:t xml:space="preserve">Purpose: decouple event creation from notification sending</w:t>
-      </w:r>
-    </w:p>
-    <w:p>
-      <w:pPr>
-        <w:spacing w:after="20"/>
-      </w:pPr>
-      <w:r>
-        <w:t xml:space="preserve">Flow:</w:t>
-      </w:r>
-    </w:p>
-    <w:p>
-      <w:pPr>
-        <w:spacing w:after="20"/>
-      </w:pPr>
-      <w:r>
-        <w:t xml:space="preserve">1. Event reminder triggers → publish job to RabbitMQ</w:t>
-      </w:r>
-    </w:p>
-    <w:p>
-      <w:pPr>
-        <w:spacing w:after="20"/>
-      </w:pPr>
-      <w:r>
-        <w:t xml:space="preserve">2. Notification worker (background process) consumes queue</w:t>
-      </w:r>
-    </w:p>
-    <w:p>
-      <w:pPr>
-        <w:spacing w:after="20"/>
-      </w:pPr>
-      <w:r>
-        <w:t xml:space="preserve">3. Worker sends push via Firebase Cloud Messaging</w:t>
-      </w:r>
-    </w:p>
-    <w:p>
-      <w:pPr>
-        <w:spacing w:after="100"/>
-      </w:pPr>
-      <w:r>
-        <w:t xml:space="preserve">4. Retries with exponential backoff if failure</w:t>
-      </w:r>
-    </w:p>
-    <w:p>
-      <w:pPr>
-        <w:spacing w:after="20"/>
-      </w:pPr>
-      <w:r>
-        <w:t xml:space="preserve">Benefits:</w:t>
-      </w:r>
-    </w:p>
-    <w:p>
-      <w:pPr>
-        <w:spacing w:after="20"/>
-      </w:pPr>
-      <w:r>
-        <w:t xml:space="preserve">• Handles high volume of notifications without blocking API</w:t>
-      </w:r>
-    </w:p>
-    <w:p>
-      <w:pPr>
-        <w:spacing w:after="20"/>
-      </w:pPr>
-      <w:r>
-        <w:t xml:space="preserve">• Scalable: add worker instances for more throughput</w:t>
-      </w:r>
-    </w:p>
-    <w:p>
-      <w:pPr>
-        <w:spacing w:after="100"/>
-      </w:pPr>
-      <w:r>
-        <w:t xml:space="preserve">• Reliable: retries failed notifications</w:t>
-      </w:r>
-    </w:p>
-    <w:p>
-      <w:pPr>
-        <w:pStyle w:val="Heading2"/>
-        <w:spacing w:after="100" w:before="150"/>
-      </w:pPr>
-      <w:r>
-        <w:t xml:space="preserve">5.5 Authentication &amp; Validation</w:t>
-      </w:r>
-    </w:p>
-    <w:p>
-      <w:pPr>
-        <w:spacing w:after="100"/>
-      </w:pPr>
-      <w:r>
-        <w:t xml:space="preserve">Supabase Auth (2FA OTP via email) | Zod (validation)</w:t>
-      </w:r>
-    </w:p>
-    <w:p>
-      <w:pPr>
-        <w:pStyle w:val="Heading2"/>
-        <w:spacing w:after="100" w:before="150"/>
-      </w:pPr>
-      <w:r>
-        <w:t xml:space="preserve">5.6 Notifications</w:t>
+        <w:t xml:space="preserve">5.1 React 19 Specific Features</w:t>
+      </w:r>
+    </w:p>
+    <w:p>
+      <w:pPr>
+        <w:spacing w:after="30"/>
+      </w:pPr>
+      <w:r>
+        <w:t xml:space="preserve">• React Compiler: automatic optimization (no need for useMemo/useCallback)</w:t>
+      </w:r>
+    </w:p>
+    <w:p>
+      <w:pPr>
+        <w:spacing w:after="30"/>
+      </w:pPr>
+      <w:r>
+        <w:t xml:space="preserve">• Actions: use for form submissions and async operations</w:t>
+      </w:r>
+    </w:p>
+    <w:p>
+      <w:pPr>
+        <w:spacing w:after="30"/>
+      </w:pPr>
+      <w:r>
+        <w:t xml:space="preserve">• useActionState: handle form state with loading/error states</w:t>
+      </w:r>
+    </w:p>
+    <w:p>
+      <w:pPr>
+        <w:spacing w:after="30"/>
+      </w:pPr>
+      <w:r>
+        <w:t xml:space="preserve">• useTransition: track pending requests during navigation</w:t>
       </w:r>
     </w:p>
     <w:p>
@@ -584,7 +604,7 @@
         <w:spacing w:after="300"/>
       </w:pPr>
       <w:r>
-        <w:t xml:space="preserve">Firebase Cloud Messaging (FCM) | Channels: Mobile | Web | Both | Disabled</w:t>
+        <w:t xml:space="preserve">• useOptimistic: optimistic UI updates (archive, event creation)</w:t>
       </w:r>
     </w:p>
     <w:r>
@@ -596,7 +616,7 @@
         <w:spacing w:after="150" w:before="200"/>
       </w:pPr>
       <w:r>
-        <w:t xml:space="preserve">6. Docker &amp; Deployment (דוקר וביצוע)</w:t>
+        <w:t xml:space="preserve">6. Notification Worker &amp; RabbitMQ (עובד התראות)</w:t>
       </w:r>
     </w:p>
     <w:p>
@@ -605,23 +625,31 @@
         <w:spacing w:after="100" w:before="150"/>
       </w:pPr>
       <w:r>
-        <w:t xml:space="preserve">6.1 Containerization</w:t>
-      </w:r>
-    </w:p>
-    <w:p>
-      <w:pPr>
-        <w:spacing w:after="30"/>
-      </w:pPr>
-      <w:r>
-        <w:t xml:space="preserve">Backend: Dockerfile for Node.js app + Express</w:t>
-      </w:r>
-    </w:p>
-    <w:p>
-      <w:pPr>
-        <w:spacing w:after="30"/>
-      </w:pPr>
-      <w:r>
-        <w:t xml:space="preserve">Worker: Dockerfile for notification worker (consumes RabbitMQ)</w:t>
+        <w:t xml:space="preserve">6.1 Architecture</w:t>
+      </w:r>
+    </w:p>
+    <w:p>
+      <w:pPr>
+        <w:spacing w:after="30"/>
+      </w:pPr>
+      <w:r>
+        <w:t xml:space="preserve">Event Creation: user creates event with reminder → backend enqueues job to RabbitMQ</w:t>
+      </w:r>
+    </w:p>
+    <w:p>
+      <w:pPr>
+        <w:spacing w:after="30"/>
+      </w:pPr>
+      <w:r>
+        <w:t xml:space="preserve">RabbitMQ Queue: "notification_reminders" queue holds all pending jobs</w:t>
+      </w:r>
+    </w:p>
+    <w:p>
+      <w:pPr>
+        <w:spacing w:after="30"/>
+      </w:pPr>
+      <w:r>
+        <w:t xml:space="preserve">Notification Worker: separate Node.js service consumes messages from queue</w:t>
       </w:r>
     </w:p>
     <w:p>
@@ -629,7 +657,7 @@
         <w:spacing w:after="100"/>
       </w:pPr>
       <w:r>
-        <w:t xml:space="preserve">docker-compose.yml: local dev (backend, worker, RabbitMQ, Postgres mock)</w:t>
+        <w:t xml:space="preserve">Scheduled Check: worker processes jobs every minute (cron-like)</w:t>
       </w:r>
     </w:p>
     <w:p>
@@ -638,39 +666,105 @@
         <w:spacing w:after="100" w:before="150"/>
       </w:pPr>
       <w:r>
-        <w:t xml:space="preserve">6.2 Deployment Strategy</w:t>
-      </w:r>
-    </w:p>
-    <w:p>
-      <w:pPr>
-        <w:spacing w:after="30"/>
-      </w:pPr>
-      <w:r>
-        <w:t xml:space="preserve">Frontend: Vercel (git push → auto deploy)</w:t>
-      </w:r>
-    </w:p>
-    <w:p>
-      <w:pPr>
-        <w:spacing w:after="30"/>
-      </w:pPr>
-      <w:r>
-        <w:t xml:space="preserve">Backend (API): Render (Docker container)</w:t>
-      </w:r>
-    </w:p>
-    <w:p>
-      <w:pPr>
-        <w:spacing w:after="30"/>
-      </w:pPr>
-      <w:r>
-        <w:t xml:space="preserve">Worker (Notifications): Render background service (Docker)</w:t>
-      </w:r>
-    </w:p>
-    <w:p>
-      <w:pPr>
-        <w:spacing w:after="30"/>
-      </w:pPr>
-      <w:r>
-        <w:t xml:space="preserve">Database: Supabase managed</w:t>
+        <w:t xml:space="preserve">6.2 Job Format</w:t>
+      </w:r>
+    </w:p>
+    <w:p>
+      <w:pPr>
+        <w:spacing w:after="100"/>
+      </w:pPr>
+      <w:r>
+        <w:t xml:space="preserve">{ eventId: UUID, userId: UUID, eventTitle: string, reminderTime: timestamp, channels: ["mobile_push", "web_push"], status: "pending"|"sent"|"failed" }</w:t>
+      </w:r>
+    </w:p>
+    <w:p>
+      <w:pPr>
+        <w:pStyle w:val="Heading2"/>
+        <w:spacing w:after="100" w:before="150"/>
+      </w:pPr>
+      <w:r>
+        <w:t xml:space="preserve">6.3 Worker Flow</w:t>
+      </w:r>
+    </w:p>
+    <w:p>
+      <w:pPr>
+        <w:spacing w:after="20"/>
+      </w:pPr>
+      <w:r>
+        <w:t xml:space="preserve">1. Consume message from RabbitMQ</w:t>
+      </w:r>
+    </w:p>
+    <w:p>
+      <w:pPr>
+        <w:spacing w:after="20"/>
+      </w:pPr>
+      <w:r>
+        <w:t xml:space="preserve">2. Check if NOW &gt;= reminderTime</w:t>
+      </w:r>
+    </w:p>
+    <w:p>
+      <w:pPr>
+        <w:spacing w:after="20"/>
+      </w:pPr>
+      <w:r>
+        <w:t xml:space="preserve">3. If yes: send Firebase push notification via FCM</w:t>
+      </w:r>
+    </w:p>
+    <w:p>
+      <w:pPr>
+        <w:spacing w:after="20"/>
+      </w:pPr>
+      <w:r>
+        <w:t xml:space="preserve">4. If success: mark status="sent", acknowledge message (remove from queue)</w:t>
+      </w:r>
+    </w:p>
+    <w:p>
+      <w:pPr>
+        <w:spacing w:after="20"/>
+      </w:pPr>
+      <w:r>
+        <w:t xml:space="preserve">5. If fail: retry with exponential backoff (max 3 attempts)</w:t>
+      </w:r>
+    </w:p>
+    <w:p>
+      <w:pPr>
+        <w:spacing w:after="100"/>
+      </w:pPr>
+      <w:r>
+        <w:t xml:space="preserve">6. If still fail: mark status="failed", send to DLQ (dead letter queue)</w:t>
+      </w:r>
+    </w:p>
+    <w:p>
+      <w:pPr>
+        <w:pStyle w:val="Heading2"/>
+        <w:spacing w:after="100" w:before="150"/>
+      </w:pPr>
+      <w:r>
+        <w:t xml:space="preserve">6.4 Benefits of RabbitMQ</w:t>
+      </w:r>
+    </w:p>
+    <w:p>
+      <w:pPr>
+        <w:spacing w:after="30"/>
+      </w:pPr>
+      <w:r>
+        <w:t xml:space="preserve">✓ Decouples API server from notification logic</w:t>
+      </w:r>
+    </w:p>
+    <w:p>
+      <w:pPr>
+        <w:spacing w:after="30"/>
+      </w:pPr>
+      <w:r>
+        <w:t xml:space="preserve">✓ Handles message queueing &amp; retries automatically</w:t>
+      </w:r>
+    </w:p>
+    <w:p>
+      <w:pPr>
+        <w:spacing w:after="30"/>
+      </w:pPr>
+      <w:r>
+        <w:t xml:space="preserve">✓ Dead Letter Queue (DLQ) for failed jobs</w:t>
       </w:r>
     </w:p>
     <w:p>
@@ -678,7 +772,7 @@
         <w:spacing w:after="300"/>
       </w:pPr>
       <w:r>
-        <w:t xml:space="preserve">Message Queue (RabbitMQ): Render managed or CloudAMQP (optional)</w:t>
+        <w:t xml:space="preserve">✓ Scalable: multiple workers can consume same queue</w:t>
       </w:r>
     </w:p>
     <w:r>
@@ -722,15 +816,15 @@
         <w:spacing w:after="30"/>
       </w:pPr>
       <w:r>
-        <w:t xml:space="preserve">GET /events - current week</w:t>
-      </w:r>
-    </w:p>
-    <w:p>
-      <w:pPr>
-        <w:spacing w:after="30"/>
-      </w:pPr>
-      <w:r>
-        <w:t xml:space="preserve">POST /events - create (validates, queues notification if reminder)</w:t>
+        <w:t xml:space="preserve">GET /events - current week events (with RLS)</w:t>
+      </w:r>
+    </w:p>
+    <w:p>
+      <w:pPr>
+        <w:spacing w:after="30"/>
+      </w:pPr>
+      <w:r>
+        <w:t xml:space="preserve">POST /events - create (validates constraints, enqueues reminder job if reminder=true)</w:t>
       </w:r>
     </w:p>
     <w:p>
@@ -754,15 +848,15 @@
         <w:spacing w:after="30"/>
       </w:pPr>
       <w:r>
-        <w:t xml:space="preserve">GET /archive?limit=50&amp;offset=0 - lazy load</w:t>
-      </w:r>
-    </w:p>
-    <w:p>
-      <w:pPr>
-        <w:spacing w:after="30"/>
-      </w:pPr>
-      <w:r>
-        <w:t xml:space="preserve">GET /gcal/events - Google Calendar</w:t>
+        <w:t xml:space="preserve">GET /archive?limit=50&amp;offset=0&amp;search=query - lazy load</w:t>
+      </w:r>
+    </w:p>
+    <w:p>
+      <w:pPr>
+        <w:spacing w:after="30"/>
+      </w:pPr>
+      <w:r>
+        <w:t xml:space="preserve">GET /gcal/events - Google Calendar (read-only)</w:t>
       </w:r>
     </w:p>
     <w:p>
@@ -798,15 +892,63 @@
         <w:spacing w:after="100"/>
       </w:pPr>
       <w:r>
-        <w:t xml:space="preserve">ALL error messages LOCALIZED (He/En)</w:t>
-      </w:r>
-    </w:p>
-    <w:p>
-      <w:pPr>
-        <w:spacing w:after="30"/>
-      </w:pPr>
-      <w:r>
-        <w:t xml:space="preserve">Validation Errors: email, title, time, files (all with He + En versions)</w:t>
+        <w:t xml:space="preserve">ALL error messages are LOCALIZED per user language (He/En)</w:t>
+      </w:r>
+    </w:p>
+    <w:p>
+      <w:pPr>
+        <w:spacing w:after="30"/>
+      </w:pPr>
+      <w:r>
+        <w:t xml:space="preserve">Validation Errors:</w:t>
+      </w:r>
+    </w:p>
+    <w:p>
+      <w:pPr>
+        <w:spacing w:after="20"/>
+      </w:pPr>
+      <w:r>
+        <w:t xml:space="preserve">Email: He "כתובת דוא"ל לא תקינה" | En "Invalid email address"</w:t>
+      </w:r>
+    </w:p>
+    <w:p>
+      <w:pPr>
+        <w:spacing w:after="20"/>
+      </w:pPr>
+      <w:r>
+        <w:t xml:space="preserve">Title: He "כותרת נדרשת" | En "Title is required"</w:t>
+      </w:r>
+    </w:p>
+    <w:p>
+      <w:pPr>
+        <w:spacing w:after="20"/>
+      </w:pPr>
+      <w:r>
+        <w:t xml:space="preserve">Time: He "שעת סיום חייבת להיות אחרי שעת התחלה" | En "End time must be after start time"</w:t>
+      </w:r>
+    </w:p>
+    <w:p>
+      <w:pPr>
+        <w:spacing w:after="50"/>
+      </w:pPr>
+      <w:r>
+        <w:t xml:space="preserve">Files: He "גודל הקובץ חייב להיות פחות מ-10 MB" | En "File size must be under 10 MB"</w:t>
+      </w:r>
+    </w:p>
+    <w:p>
+      <w:pPr>
+        <w:spacing w:after="30"/>
+      </w:pPr>
+      <w:r>
+        <w:t xml:space="preserve">Network Errors:</w:t>
+      </w:r>
+    </w:p>
+    <w:p>
+      <w:pPr>
+        <w:spacing w:after="20"/>
+      </w:pPr>
+      <w:r>
+        <w:t xml:space="preserve">Archive fetch fails: He "שגיאה בטעינת ארכיון" | En "Failed to load archive"</w:t>
       </w:r>
     </w:p>
     <w:p>
@@ -814,7 +956,7 @@
         <w:spacing w:after="300"/>
       </w:pPr>
       <w:r>
-        <w:t xml:space="preserve">Network Errors: archive fetch fails → He "שגיאה בטעינת ארכיון" | En "Failed to load archive"</w:t>
+        <w:t xml:space="preserve">With retry button to repeat request</w:t>
       </w:r>
     </w:p>
     <w:p>
@@ -831,7 +973,23 @@
         <w:spacing w:after="30"/>
       </w:pPr>
       <w:r>
-        <w:t xml:space="preserve">UI: Hebrew (he) or English (en) | User Content: NOT localized | Errors: ALL localized</w:t>
+        <w:t xml:space="preserve">UI Language: Hebrew (he) or English (en)</w:t>
+      </w:r>
+    </w:p>
+    <w:p>
+      <w:pPr>
+        <w:spacing w:after="30"/>
+      </w:pPr>
+      <w:r>
+        <w:t xml:space="preserve">User Content: NOT localized (entered as-is)</w:t>
+      </w:r>
+    </w:p>
+    <w:p>
+      <w:pPr>
+        <w:spacing w:after="30"/>
+      </w:pPr>
+      <w:r>
+        <w:t xml:space="preserve">Error Messages: ALL localized (He + En version required)</w:t>
       </w:r>
     </w:p>
     <w:p>
@@ -840,195 +998,6 @@
       </w:pPr>
       <w:r>
         <w:t xml:space="preserve">RTL: dir="rtl" Hebrew, dir="ltr" English</w:t>
-      </w:r>
-    </w:p>
-    <w:p>
-      <w:pPr>
-        <w:pStyle w:val="Heading1"/>
-        <w:spacing w:after="150" w:before="200"/>
-      </w:pPr>
-      <w:r>
-        <w:t xml:space="preserve">10. Performance &amp; Scalability (ביצועים)</w:t>
-      </w:r>
-    </w:p>
-    <w:p>
-      <w:pPr>
-        <w:spacing w:after="30"/>
-      </w:pPr>
-      <w:r>
-        <w:t xml:space="preserve">Frontend: code splitting, memoization, virtual scrolling</w:t>
-      </w:r>
-    </w:p>
-    <w:p>
-      <w:pPr>
-        <w:spacing w:after="30"/>
-      </w:pPr>
-      <w:r>
-        <w:t xml:space="preserve">Backend: rate limiting (100 req/min), DB indexing (&lt; 50ms)</w:t>
-      </w:r>
-    </w:p>
-    <w:p>
-      <w:pPr>
-        <w:spacing w:after="300"/>
-      </w:pPr>
-      <w:r>
-        <w:t xml:space="preserve">Notifications: RabbitMQ queue handles burst traffic, worker autoscales</w:t>
-      </w:r>
-    </w:p>
-    <w:p>
-      <w:pPr>
-        <w:pStyle w:val="Heading1"/>
-        <w:spacing w:after="150" w:before="200"/>
-      </w:pPr>
-      <w:r>
-        <w:t xml:space="preserve">11. Security &amp; Authentication (אבטחה)</w:t>
-      </w:r>
-    </w:p>
-    <w:p>
-      <w:pPr>
-        <w:spacing w:after="30"/>
-      </w:pPr>
-      <w:r>
-        <w:t xml:space="preserve">Passwordless: Supabase Auth (2FA OTP) | JWT in httpOnly cookie | RLS on all data</w:t>
-      </w:r>
-    </w:p>
-    <w:p>
-      <w:pPr>
-        <w:spacing w:after="300"/>
-      </w:pPr>
-      <w:r>
-        <w:t xml:space="preserve">Validation: Zod | RabbitMQ: credentials secured, messages encrypted in transit</w:t>
-      </w:r>
-    </w:p>
-    <w:p>
-      <w:pPr>
-        <w:pStyle w:val="Heading1"/>
-        <w:spacing w:after="150" w:before="200"/>
-      </w:pPr>
-      <w:r>
-        <w:t xml:space="preserve">12. Push Notifications &amp; RabbitMQ Queue (התראות דחיפה)</w:t>
-      </w:r>
-    </w:p>
-    <w:p>
-      <w:pPr>
-        <w:pStyle w:val="Heading2"/>
-        <w:spacing w:after="100" w:before="150"/>
-      </w:pPr>
-      <w:r>
-        <w:t xml:space="preserve">12.1 Architecture</w:t>
-      </w:r>
-    </w:p>
-    <w:p>
-      <w:pPr>
-        <w:spacing w:after="20"/>
-      </w:pPr>
-      <w:r>
-        <w:t xml:space="preserve">Event Creation:</w:t>
-      </w:r>
-    </w:p>
-    <w:p>
-      <w:pPr>
-        <w:spacing w:after="20"/>
-      </w:pPr>
-      <w:r>
-        <w:t xml:space="preserve">1. User creates event with reminder</w:t>
-      </w:r>
-    </w:p>
-    <w:p>
-      <w:pPr>
-        <w:spacing w:after="20"/>
-      </w:pPr>
-      <w:r>
-        <w:t xml:space="preserve">2. API validates and saves to Supabase</w:t>
-      </w:r>
-    </w:p>
-    <w:p>
-      <w:pPr>
-        <w:spacing w:after="50"/>
-      </w:pPr>
-      <w:r>
-        <w:t xml:space="preserve">3. API publishes notification job to RabbitMQ (async)</w:t>
-      </w:r>
-    </w:p>
-    <w:p>
-      <w:pPr>
-        <w:spacing w:after="20"/>
-      </w:pPr>
-      <w:r>
-        <w:t xml:space="preserve">Notification Worker:</w:t>
-      </w:r>
-    </w:p>
-    <w:p>
-      <w:pPr>
-        <w:spacing w:after="20"/>
-      </w:pPr>
-      <w:r>
-        <w:t xml:space="preserve">1. Consumes jobs from RabbitMQ queue</w:t>
-      </w:r>
-    </w:p>
-    <w:p>
-      <w:pPr>
-        <w:spacing w:after="20"/>
-      </w:pPr>
-      <w:r>
-        <w:t xml:space="preserve">2. Fetches event details from Supabase</w:t>
-      </w:r>
-    </w:p>
-    <w:p>
-      <w:pPr>
-        <w:spacing w:after="20"/>
-      </w:pPr>
-      <w:r>
-        <w:t xml:space="preserve">3. Gets user FCM tokens and preferences</w:t>
-      </w:r>
-    </w:p>
-    <w:p>
-      <w:pPr>
-        <w:spacing w:after="20"/>
-      </w:pPr>
-      <w:r>
-        <w:t xml:space="preserve">4. Sends push via Firebase Cloud Messaging</w:t>
-      </w:r>
-    </w:p>
-    <w:p>
-      <w:pPr>
-        <w:spacing w:after="100"/>
-      </w:pPr>
-      <w:r>
-        <w:t xml:space="preserve">5. Retries with exponential backoff on failure (max 3 retries)</w:t>
-      </w:r>
-    </w:p>
-    <w:p>
-      <w:pPr>
-        <w:pStyle w:val="Heading2"/>
-        <w:spacing w:after="100" w:before="150"/>
-      </w:pPr>
-      <w:r>
-        <w:t xml:space="preserve">12.2 Scaling</w:t>
-      </w:r>
-    </w:p>
-    <w:p>
-      <w:pPr>
-        <w:spacing w:after="30"/>
-      </w:pPr>
-      <w:r>
-        <w:t xml:space="preserve">Single worker: handles ~100-200 notifications/minute</w:t>
-      </w:r>
-    </w:p>
-    <w:p>
-      <w:pPr>
-        <w:spacing w:after="30"/>
-      </w:pPr>
-      <w:r>
-        <w:t xml:space="preserve">Multiple workers: deploy multiple worker containers on Render</w:t>
-      </w:r>
-    </w:p>
-    <w:p>
-      <w:pPr>
-        <w:spacing w:after="300"/>
-      </w:pPr>
-      <w:r>
-        <w:t xml:space="preserve">RabbitMQ: automatically distributes jobs across workers</w:t>
       </w:r>
     </w:p>
     <w:r>
@@ -1040,23 +1009,39 @@
         <w:spacing w:after="150" w:before="200"/>
       </w:pPr>
       <w:r>
-        <w:t xml:space="preserve">13. Testing Strategy (אסטרטגיית בדיקה)</w:t>
-      </w:r>
-    </w:p>
-    <w:p>
-      <w:pPr>
-        <w:spacing w:after="30"/>
-      </w:pPr>
-      <w:r>
-        <w:t xml:space="preserve">Unit: validation, field limits, time comparison</w:t>
-      </w:r>
-    </w:p>
-    <w:p>
-      <w:pPr>
-        <w:spacing w:after="30"/>
-      </w:pPr>
-      <w:r>
-        <w:t xml:space="preserve">Integration: API endpoints, file handling, pagination, RabbitMQ queue publishing</w:t>
+        <w:t xml:space="preserve">10. Performance &amp; Scalability (ביצועים)</w:t>
+      </w:r>
+    </w:p>
+    <w:p>
+      <w:pPr>
+        <w:spacing w:after="30"/>
+      </w:pPr>
+      <w:r>
+        <w:t xml:space="preserve">Frontend: React 19 compiler handles optimization, lazy loading with &lt;Suspense&gt;</w:t>
+      </w:r>
+    </w:p>
+    <w:p>
+      <w:pPr>
+        <w:spacing w:after="30"/>
+      </w:pPr>
+      <w:r>
+        <w:t xml:space="preserve">Backend: Supabase with DB indexing, rate limiting (100 req/min)</w:t>
+      </w:r>
+    </w:p>
+    <w:p>
+      <w:pPr>
+        <w:spacing w:after="30"/>
+      </w:pPr>
+      <w:r>
+        <w:t xml:space="preserve">Archive pagination: 50 days per request, &lt; 50ms query time</w:t>
+      </w:r>
+    </w:p>
+    <w:p>
+      <w:pPr>
+        <w:spacing w:after="30"/>
+      </w:pPr>
+      <w:r>
+        <w:t xml:space="preserve">Client caching: React state for loaded archive pages</w:t>
       </w:r>
     </w:p>
     <w:p>
@@ -1064,7 +1049,48 @@
         <w:spacing w:after="300"/>
       </w:pPr>
       <w:r>
-        <w:t xml:space="preserve">E2E: full workflows in He/En, lazy loading, notifications queue &amp; delivery</w:t>
+        <w:t xml:space="preserve">Message Queue: RabbitMQ ensures reliable notification delivery without blocking API</w:t>
+      </w:r>
+    </w:p>
+    <w:p>
+      <w:pPr>
+        <w:pStyle w:val="Heading1"/>
+        <w:spacing w:after="150" w:before="200"/>
+      </w:pPr>
+      <w:r>
+        <w:t xml:space="preserve">11. Security &amp; Authentication (אבטחה)</w:t>
+      </w:r>
+    </w:p>
+    <w:p>
+      <w:pPr>
+        <w:spacing w:after="30"/>
+      </w:pPr>
+      <w:r>
+        <w:t xml:space="preserve">Passwordless: email + 2FA OTP (Supabase Auth)</w:t>
+      </w:r>
+    </w:p>
+    <w:p>
+      <w:pPr>
+        <w:spacing w:after="30"/>
+      </w:pPr>
+      <w:r>
+        <w:t xml:space="preserve">Session: JWT in httpOnly cookie</w:t>
+      </w:r>
+    </w:p>
+    <w:p>
+      <w:pPr>
+        <w:spacing w:after="30"/>
+      </w:pPr>
+      <w:r>
+        <w:t xml:space="preserve">Row-Level Security (RLS): all data user_id scoped</w:t>
+      </w:r>
+    </w:p>
+    <w:p>
+      <w:pPr>
+        <w:spacing w:after="300"/>
+      </w:pPr>
+      <w:r>
+        <w:t xml:space="preserve">Validation: Zod on backend, all inputs sanitized</w:t>
       </w:r>
     </w:p>
     <w:r>
@@ -1072,6 +1098,50 @@
     </w:r>
     <w:p>
       <w:pPr>
+        <w:pStyle w:val="Heading1"/>
+        <w:spacing w:after="150" w:before="200"/>
+      </w:pPr>
+      <w:r>
+        <w:t xml:space="preserve">12. Push Notifications (התראות דחיפה)</w:t>
+      </w:r>
+    </w:p>
+    <w:p>
+      <w:pPr>
+        <w:spacing w:after="30"/>
+      </w:pPr>
+      <w:r>
+        <w:t xml:space="preserve">Firebase Cloud Messaging (FCM) - FREE tier</w:t>
+      </w:r>
+    </w:p>
+    <w:p>
+      <w:pPr>
+        <w:spacing w:after="30"/>
+      </w:pPr>
+      <w:r>
+        <w:t xml:space="preserve">Channels: Mobile Push | Web Push | Both | Disabled</w:t>
+      </w:r>
+    </w:p>
+    <w:p>
+      <w:pPr>
+        <w:spacing w:after="30"/>
+      </w:pPr>
+      <w:r>
+        <w:t xml:space="preserve">Delivery: ONLY outside app (push alerts, NOT in-app)</w:t>
+      </w:r>
+    </w:p>
+    <w:p>
+      <w:pPr>
+        <w:spacing w:after="300"/>
+      </w:pPr>
+      <w:r>
+        <w:t xml:space="preserve">Worker: RabbitMQ consumer (separate Node.js service) sends via FCM</w:t>
+      </w:r>
+    </w:p>
+    <w:r>
+      <w:br w:type="page"/>
+    </w:r>
+    <w:p>
+      <w:pPr>
         <w:spacing w:after="100" w:before="300"/>
         <w:jc w:val="center"/>
       </w:pPr>
@@ -1084,7 +1154,7 @@
         <w:jc w:val="center"/>
       </w:pPr>
       <w:r>
-        <w:t xml:space="preserve">SederYom FRD v1.0 | RabbitMQ for scalable notifications | Docker + Vercel/Render</w:t>
+        <w:t xml:space="preserve">SederYom FRD v1.0 | React 19 + RabbitMQ</w:t>
       </w:r>
     </w:p>
     <w:sectPr>

</xml_diff>